<commit_message>
Brisas, mirador, basa y demas
</commit_message>
<xml_diff>
--- a/2026/EL MIRADOR/Lista de mails.docx
+++ b/2026/EL MIRADOR/Lista de mails.docx
@@ -1,6 +1,6 @@
 
 <file path=word/document.xml><?xml version="1.0" encoding="utf-8"?>
-<w:document xmlns:wpc="http://schemas.microsoft.com/office/word/2010/wordprocessingCanvas" xmlns:cx="http://schemas.microsoft.com/office/drawing/2014/chartex" xmlns:cx1="http://schemas.microsoft.com/office/drawing/2015/9/8/chartex" xmlns:cx2="http://schemas.microsoft.com/office/drawing/2015/10/21/chartex" xmlns:cx3="http://schemas.microsoft.com/office/drawing/2016/5/9/chartex" xmlns:cx4="http://schemas.microsoft.com/office/drawing/2016/5/10/chartex" xmlns:cx5="http://schemas.microsoft.com/office/drawing/2016/5/11/chartex" xmlns:cx6="http://schemas.microsoft.com/office/drawing/2016/5/12/chartex" xmlns:cx7="http://schemas.microsoft.com/office/drawing/2016/5/13/chartex" xmlns:cx8="http://schemas.microsoft.com/office/drawing/2016/5/14/chartex" xmlns:mc="http://schemas.openxmlformats.org/markup-compatibility/2006" xmlns:aink="http://schemas.microsoft.com/office/drawing/2016/ink" xmlns:am3d="http://schemas.microsoft.com/office/drawing/2017/model3d" xmlns:o="urn:schemas-microsoft-com:office:office" xmlns:oel="http://schemas.microsoft.com/office/2019/extlst" xmlns:r="http://schemas.openxmlformats.org/officeDocument/2006/relationships" xmlns:m="http://schemas.openxmlformats.org/officeDocument/2006/math" xmlns:v="urn:schemas-microsoft-com:vml" xmlns:wp14="http://schemas.microsoft.com/office/word/2010/wordprocessingDrawing" xmlns:wp="http://schemas.openxmlformats.org/drawingml/2006/wordprocessingDrawing" xmlns:w10="urn:schemas-microsoft-com:office:word" xmlns:w="http://schemas.openxmlformats.org/wordprocessingml/2006/main" xmlns:w14="http://schemas.microsoft.com/office/word/2010/wordml" xmlns:w15="http://schemas.microsoft.com/office/word/2012/wordml" xmlns:w16cex="http://schemas.microsoft.com/office/word/2018/wordml/cex" xmlns:w16cid="http://schemas.microsoft.com/office/word/2016/wordml/cid" xmlns:w16="http://schemas.microsoft.com/office/word/2018/wordml" xmlns:w16du="http://schemas.microsoft.com/office/word/2023/wordml/word16du" xmlns:w16sdtdh="http://schemas.microsoft.com/office/word/2020/wordml/sdtdatahash" xmlns:w16sdtfl="http://schemas.microsoft.com/office/word/2024/wordml/sdtformatlock" xmlns:w16se="http://schemas.microsoft.com/office/word/2015/wordml/symex" xmlns:wpg="http://schemas.microsoft.com/office/word/2010/wordprocessingGroup" xmlns:wpi="http://schemas.microsoft.com/office/word/2010/wordprocessingInk" xmlns:wne="http://schemas.microsoft.com/office/word/2006/wordml" xmlns:wps="http://schemas.microsoft.com/office/word/2010/wordprocessingShape" mc:Ignorable="w14 w15 w16se w16cid w16 w16cex w16sdtdh w16sdtfl w16du wp14">
+<w:document xmlns:wpc="http://schemas.microsoft.com/office/word/2010/wordprocessingCanvas" xmlns:cx="http://schemas.microsoft.com/office/drawing/2014/chartex" xmlns:cx1="http://schemas.microsoft.com/office/drawing/2015/9/8/chartex" xmlns:cx2="http://schemas.microsoft.com/office/drawing/2015/10/21/chartex" xmlns:cx3="http://schemas.microsoft.com/office/drawing/2016/5/9/chartex" xmlns:cx4="http://schemas.microsoft.com/office/drawing/2016/5/10/chartex" xmlns:cx5="http://schemas.microsoft.com/office/drawing/2016/5/11/chartex" xmlns:cx6="http://schemas.microsoft.com/office/drawing/2016/5/12/chartex" xmlns:cx7="http://schemas.microsoft.com/office/drawing/2016/5/13/chartex" xmlns:cx8="http://schemas.microsoft.com/office/drawing/2016/5/14/chartex" xmlns:mc="http://schemas.openxmlformats.org/markup-compatibility/2006" xmlns:aink="http://schemas.microsoft.com/office/drawing/2016/ink" xmlns:am3d="http://schemas.microsoft.com/office/drawing/2017/model3d" xmlns:o="urn:schemas-microsoft-com:office:office" xmlns:r="http://schemas.openxmlformats.org/officeDocument/2006/relationships" xmlns:m="http://schemas.openxmlformats.org/officeDocument/2006/math" xmlns:v="urn:schemas-microsoft-com:vml" xmlns:wp14="http://schemas.microsoft.com/office/word/2010/wordprocessingDrawing" xmlns:wp="http://schemas.openxmlformats.org/drawingml/2006/wordprocessingDrawing" xmlns:w10="urn:schemas-microsoft-com:office:word" xmlns:w="http://schemas.openxmlformats.org/wordprocessingml/2006/main" xmlns:w14="http://schemas.microsoft.com/office/word/2010/wordml" xmlns:w15="http://schemas.microsoft.com/office/word/2012/wordml" xmlns:w16cex="http://schemas.microsoft.com/office/word/2018/wordml/cex" xmlns:w16cid="http://schemas.microsoft.com/office/word/2016/wordml/cid" xmlns:w16="http://schemas.microsoft.com/office/word/2018/wordml" xmlns:w16sdtdh="http://schemas.microsoft.com/office/word/2020/wordml/sdtdatahash" xmlns:w16se="http://schemas.microsoft.com/office/word/2015/wordml/symex" xmlns:wpg="http://schemas.microsoft.com/office/word/2010/wordprocessingGroup" xmlns:wpi="http://schemas.microsoft.com/office/word/2010/wordprocessingInk" xmlns:wne="http://schemas.microsoft.com/office/word/2006/wordml" xmlns:wps="http://schemas.microsoft.com/office/word/2010/wordprocessingShape" mc:Ignorable="w14 w15 w16se w16cid w16 w16cex w16sdtdh wp14">
   <w:body>
     <w:p>
       <w:r>
@@ -162,163 +162,184 @@
         <w:br/>
         <w:t>Marisa Hernández &lt;hernandezmarisaok@gmail.com&gt;,</w:t>
       </w:r>
+    </w:p>
+    <w:p>
+      <w:r>
+        <w:lastRenderedPageBreak/>
+        <w:t>nancymarcelo@hotmail.com,</w:t>
+      </w:r>
       <w:r>
         <w:br/>
         <w:t>hernandez_aj4@hotmail.com,</w:t>
       </w:r>
       <w:r>
         <w:br/>
+        <w:t>Administracion IMH &lt;administracion@imhsa.com.ar&gt;,</w:t>
+      </w:r>
+      <w:r>
+        <w:br/>
+        <w:t>iaracuevass99@gmail.com,</w:t>
+      </w:r>
+      <w:r>
+        <w:br/>
+        <w:t>irigoyenm@remax.com.ar,</w:t>
+      </w:r>
+      <w:r>
+        <w:br/>
+        <w:t>info@teodosiu.com.ar,</w:t>
+      </w:r>
+      <w:r>
+        <w:br/>
+        <w:t>jaracuevass99@gmail.com,</w:t>
+      </w:r>
+      <w:r>
+        <w:br/>
+        <w:t>Jorge Armerding &lt;metalurgicamarmol@yahoo.com.ar&gt;,</w:t>
+      </w:r>
+      <w:r>
+        <w:br/>
+        <w:t>Julio Mosquera &lt;juliormosquera@gmail.com&gt;,</w:t>
+      </w:r>
+      <w:r>
+        <w:br/>
+        <w:t>Javier Nuñez Leyes &lt;javier.nunezleyes@gmail.com&gt;,</w:t>
+      </w:r>
+      <w:r>
+        <w:br/>
+        <w:t>"jlorsi1512@gmail.com" &lt;jlorsi1512@gmail.com&gt;,</w:t>
+      </w:r>
+      <w:r>
+        <w:br/>
+        <w:t>javier.nuñezleyes@gmail.com,</w:t>
+      </w:r>
+      <w:r>
+        <w:br/>
+        <w:t>Liria Diaz &lt;liriacjs@gmail.com&gt;,</w:t>
+      </w:r>
+      <w:r>
+        <w:br/>
+        <w:t>lidiajavieradiaz@gmail.com,</w:t>
+      </w:r>
+      <w:r>
+        <w:br/>
+        <w:t>luciazoe1997@gmail.com,</w:t>
+      </w:r>
+      <w:r>
+        <w:br/>
+        <w:t>libra552005 &lt;libra552005@yahoo.com.ar&gt;,</w:t>
+      </w:r>
+      <w:r>
+        <w:br/>
+        <w:t>"lorenalobato.02@gmail.com" &lt;lorenalobato.02@gmail.com&gt;,</w:t>
+      </w:r>
+      <w:r>
+        <w:br/>
+        <w:t>Matias Puente &lt;matiasepuente@gmail.com&gt;,</w:t>
+      </w:r>
+      <w:r>
+        <w:br/>
+        <w:t>Patricia Cadahia &lt;patocadahia@gmail.com&gt;,</w:t>
+      </w:r>
+      <w:r>
+        <w:br/>
+        <w:t>pcadahia@aluviconstruccion.com.ar,</w:t>
+      </w:r>
+      <w:r>
+        <w:br/>
+        <w:t>Pablo Amarilla &lt;Pabloamarilla453@gmail.com&gt;,</w:t>
+      </w:r>
+      <w:r>
+        <w:br/>
+      </w:r>
+      <w:hyperlink r:id="rId4" w:history="1">
+        <w:r>
+          <w:rPr>
+            <w:rStyle w:val="Hipervnculo"/>
+          </w:rPr>
+          <w:t>pabloamarrilla453@gmail.com</w:t>
+        </w:r>
+      </w:hyperlink>
+      <w:r>
+        <w:t>,</w:t>
+      </w:r>
+    </w:p>
+    <w:p>
+      <w:r>
+        <w:t>raugoss@gmail.com,</w:t>
+      </w:r>
+      <w:r>
+        <w:br/>
+        <w:t>rosales42marcos@hotmail.com,</w:t>
+      </w:r>
+      <w:r>
+        <w:br/>
+        <w:t>rociosoria2088@hotmail.com,</w:t>
+      </w:r>
+      <w:r>
+        <w:br/>
+        <w:t>ruben rosales &lt;rubenrosales@live.com.ar&gt;,</w:t>
+      </w:r>
+      <w:r>
+        <w:br/>
+        <w:t>Silvina Ravazzani &lt;silvinaravazzani@hotmail.com&gt;,</w:t>
+      </w:r>
+      <w:r>
+        <w:br/>
+        <w:t>Rocio Soria &lt;rociosoria2008@hotmail.com&gt;,</w:t>
+      </w:r>
+      <w:r>
+        <w:br/>
+        <w:t>Santi &lt;santiago.martin.rodriguez@hotmail.com&gt;,</w:t>
+      </w:r>
+      <w:r>
+        <w:br/>
+        <w:t>roxanafedullo@hotmail.com,</w:t>
+      </w:r>
+      <w:r>
+        <w:br/>
+        <w:t>veronica &lt;veroluciano@hotmail.com&gt;,</w:t>
+      </w:r>
+      <w:r>
+        <w:br/>
+        <w:t>Alejandra Veronica Garcia &lt;Alejandra.Garcia@newsan.com.ar&gt;,</w:t>
+      </w:r>
+      <w:r>
+        <w:br/>
+        <w:t>victoria.morandi14@gmail.com,</w:t>
+      </w:r>
+      <w:r>
+        <w:br/>
+        <w:t>valfa76@hotmail.com,</w:t>
+      </w:r>
+      <w:r>
+        <w:br/>
+        <w:t>wgledesma5@gmail.com,</w:t>
+      </w:r>
+      <w:r>
+        <w:br/>
+        <w:t>Christian Fernandez | MD y Asociados &lt;Christian.Fernandez@mdyasociados.com.ar&gt;,</w:t>
+      </w:r>
+      <w:r>
+        <w:br/>
+        <w:t>yaninacuevas2019@gmail.com,</w:t>
+      </w:r>
+      <w:r>
+        <w:br/>
+        <w:t>guillermofridgi@gmail.com,</w:t>
+      </w:r>
+      <w:r>
+        <w:br/>
+        <w:t>leonel.gustavo.n@hotmail.com,</w:t>
+      </w:r>
+      <w:r>
+        <w:br/>
+        <w:t>gulo_39@hotmail.com,</w:t>
+      </w:r>
+      <w:r>
+        <w:br/>
       </w:r>
       <w:r>
         <w:lastRenderedPageBreak/>
-        <w:t>Administracion IMH &lt;administracion@imhsa.com.ar&gt;,</w:t>
-      </w:r>
-      <w:r>
-        <w:br/>
-        <w:t>iaracuevass99@gmail.com,</w:t>
-      </w:r>
-      <w:r>
-        <w:br/>
-        <w:t>irigoyenm@remax.com.ar,</w:t>
-      </w:r>
-      <w:r>
-        <w:br/>
-        <w:t>info@teodosiu.com.ar,</w:t>
-      </w:r>
-      <w:r>
-        <w:br/>
-        <w:t>jaracuevass99@gmail.com,</w:t>
-      </w:r>
-      <w:r>
-        <w:br/>
-        <w:t>Jorge Armerding &lt;metalurgicamarmol@yahoo.com.ar&gt;,</w:t>
-      </w:r>
-      <w:r>
-        <w:br/>
-        <w:t>Julio Mosquera &lt;juliormosquera@gmail.com&gt;,</w:t>
-      </w:r>
-      <w:r>
-        <w:br/>
-        <w:t>Javier Nuñez Leyes &lt;javier.nunezleyes@gmail.com&gt;,</w:t>
-      </w:r>
-      <w:r>
-        <w:br/>
-        <w:t>"jlorsi1512@gmail.com" &lt;jlorsi1512@gmail.com&gt;,</w:t>
-      </w:r>
-      <w:r>
-        <w:br/>
-        <w:t>javier.nuñezleyes@gmail.com,</w:t>
-      </w:r>
-      <w:r>
-        <w:br/>
-        <w:t>Liria Diaz &lt;liriacjs@gmail.com&gt;,</w:t>
-      </w:r>
-      <w:r>
-        <w:br/>
-        <w:t>lidiajavieradiaz@gmail.com,</w:t>
-      </w:r>
-      <w:r>
-        <w:br/>
-        <w:t>luciazoe1997@gmail.com,</w:t>
-      </w:r>
-      <w:r>
-        <w:br/>
-        <w:t>libra552005 &lt;libra552005@yahoo.com.ar&gt;,</w:t>
-      </w:r>
-      <w:r>
-        <w:br/>
-        <w:t>"lorenalobato.02@gmail.com" &lt;lorenalobato.02@gmail.com&gt;,</w:t>
-      </w:r>
-      <w:r>
-        <w:br/>
-        <w:t>Matias Puente &lt;matiasepuente@gmail.com&gt;,</w:t>
-      </w:r>
-      <w:r>
-        <w:br/>
-        <w:t>Patricia Cadahia &lt;patocadahia@gmail.com&gt;,</w:t>
-      </w:r>
-      <w:r>
-        <w:br/>
-        <w:t>pcadahia@aluviconstruccion.com.ar,</w:t>
-      </w:r>
-      <w:r>
-        <w:br/>
-        <w:t>Pablo Amarilla &lt;Pabloamarilla453@gmail.com&gt;,</w:t>
-      </w:r>
-      <w:r>
-        <w:br/>
-        <w:t>pabloamarrilla453@gmail.com,</w:t>
-      </w:r>
-      <w:r>
-        <w:br/>
-        <w:t>rosales42marcos@hotmail.com,</w:t>
-      </w:r>
-      <w:r>
-        <w:br/>
-        <w:t>rociosoria2088@hotmail.com,</w:t>
-      </w:r>
-      <w:r>
-        <w:br/>
-        <w:t>ruben rosales &lt;rubenrosales@live.com.ar&gt;,</w:t>
-      </w:r>
-      <w:r>
-        <w:br/>
-        <w:t>Silvina Ravazzani &lt;silvinaravazzani@hotmail.com&gt;,</w:t>
-      </w:r>
-      <w:r>
-        <w:br/>
-        <w:t>Rocio Soria &lt;rociosoria2008@hotmail.com&gt;,</w:t>
-      </w:r>
-      <w:r>
-        <w:br/>
-        <w:t>Santi &lt;santiago.martin.rodriguez@hotmail.com&gt;,</w:t>
-      </w:r>
-      <w:r>
-        <w:br/>
-        <w:t>roxanafedullo@hotmail.com,</w:t>
-      </w:r>
-      <w:r>
-        <w:br/>
-        <w:t>veronica &lt;veroluciano@hotmail.com&gt;,</w:t>
-      </w:r>
-      <w:r>
-        <w:br/>
-        <w:t>Alejandra Veronica Garcia &lt;Alejandra.Garcia@newsan.com.ar&gt;,</w:t>
-      </w:r>
-      <w:r>
-        <w:br/>
-        <w:t>victoria.morandi14@gmail.com,</w:t>
-      </w:r>
-      <w:r>
-        <w:br/>
-        <w:t>valfa76@hotmail.com,</w:t>
-      </w:r>
-      <w:r>
-        <w:br/>
-        <w:t>wgledesma5@gmail.com,</w:t>
-      </w:r>
-      <w:r>
-        <w:br/>
-        <w:t>Christian Fernandez | MD y Asociados &lt;Christian.Fernandez@mdyasociados.com.ar&gt;,</w:t>
-      </w:r>
-      <w:r>
-        <w:br/>
-        <w:t>yaninacuevas2019@gmail.com,</w:t>
-      </w:r>
-      <w:r>
-        <w:br/>
-        <w:t>guillermofridgi@gmail.com,</w:t>
-      </w:r>
-      <w:r>
-        <w:br/>
-        <w:t>leonel.gustavo.n@hotmail.com,</w:t>
-      </w:r>
-      <w:r>
-        <w:br/>
-        <w:t>gulo_39@hotmail.com,</w:t>
-      </w:r>
-      <w:r>
-        <w:br/>
         <w:t>gullermofrigidi@gmail.com,</w:t>
       </w:r>
       <w:r>
@@ -335,9 +356,6 @@
       </w:r>
       <w:r>
         <w:br/>
-      </w:r>
-      <w:r>
-        <w:lastRenderedPageBreak/>
         <w:t>"Anchipi, Gaston Nicolas" &lt;ganchipi@segurosrivadavia.com&gt;,</w:t>
       </w:r>
       <w:r>
@@ -392,7 +410,7 @@
 </file>
 
 <file path=word/styles.xml><?xml version="1.0" encoding="utf-8"?>
-<w:styles xmlns:mc="http://schemas.openxmlformats.org/markup-compatibility/2006" xmlns:r="http://schemas.openxmlformats.org/officeDocument/2006/relationships" xmlns:w="http://schemas.openxmlformats.org/wordprocessingml/2006/main" xmlns:w14="http://schemas.microsoft.com/office/word/2010/wordml" xmlns:w15="http://schemas.microsoft.com/office/word/2012/wordml" xmlns:w16cex="http://schemas.microsoft.com/office/word/2018/wordml/cex" xmlns:w16cid="http://schemas.microsoft.com/office/word/2016/wordml/cid" xmlns:w16="http://schemas.microsoft.com/office/word/2018/wordml" xmlns:w16du="http://schemas.microsoft.com/office/word/2023/wordml/word16du" xmlns:w16sdtdh="http://schemas.microsoft.com/office/word/2020/wordml/sdtdatahash" xmlns:w16sdtfl="http://schemas.microsoft.com/office/word/2024/wordml/sdtformatlock" xmlns:w16se="http://schemas.microsoft.com/office/word/2015/wordml/symex" mc:Ignorable="w14 w15 w16se w16cid w16 w16cex w16sdtdh w16sdtfl w16du">
+<w:styles xmlns:mc="http://schemas.openxmlformats.org/markup-compatibility/2006" xmlns:r="http://schemas.openxmlformats.org/officeDocument/2006/relationships" xmlns:w="http://schemas.openxmlformats.org/wordprocessingml/2006/main" xmlns:w14="http://schemas.microsoft.com/office/word/2010/wordml" xmlns:w15="http://schemas.microsoft.com/office/word/2012/wordml" xmlns:w16cex="http://schemas.microsoft.com/office/word/2018/wordml/cex" xmlns:w16cid="http://schemas.microsoft.com/office/word/2016/wordml/cid" xmlns:w16="http://schemas.microsoft.com/office/word/2018/wordml" xmlns:w16sdtdh="http://schemas.microsoft.com/office/word/2020/wordml/sdtdatahash" xmlns:w16se="http://schemas.microsoft.com/office/word/2015/wordml/symex" mc:Ignorable="w14 w15 w16se w16cid w16 w16cex w16sdtdh">
   <w:docDefaults>
     <w:rPrDefault>
       <w:rPr>
@@ -1308,6 +1326,29 @@
       <w:spacing w:val="5"/>
     </w:rPr>
   </w:style>
+  <w:style w:type="character" w:styleId="Hipervnculo">
+    <w:name w:val="Hyperlink"/>
+    <w:basedOn w:val="Fuentedeprrafopredeter"/>
+    <w:uiPriority w:val="99"/>
+    <w:unhideWhenUsed/>
+    <w:rsid w:val="002B10AF"/>
+    <w:rPr>
+      <w:color w:val="0563C1" w:themeColor="hyperlink"/>
+      <w:u w:val="single"/>
+    </w:rPr>
+  </w:style>
+  <w:style w:type="character" w:styleId="Mencinsinresolver">
+    <w:name w:val="Unresolved Mention"/>
+    <w:basedOn w:val="Fuentedeprrafopredeter"/>
+    <w:uiPriority w:val="99"/>
+    <w:semiHidden/>
+    <w:unhideWhenUsed/>
+    <w:rsid w:val="002B10AF"/>
+    <w:rPr>
+      <w:color w:val="605E5C"/>
+      <w:shd w:val="clear" w:color="auto" w:fill="E1DFDD"/>
+    </w:rPr>
+  </w:style>
 </w:styles>
 </file>
 

</xml_diff>

<commit_message>
subiendo primeras cosas de julio
</commit_message>
<xml_diff>
--- a/2026/EL MIRADOR/Lista de mails.docx
+++ b/2026/EL MIRADOR/Lista de mails.docx
@@ -108,7 +108,25 @@
       </w:r>
       <w:r>
         <w:br/>
-        <w:t>diemart2@hotmail.com,</w:t>
+      </w:r>
+      <w:hyperlink r:id="rId4" w:history="1">
+        <w:r>
+          <w:rPr>
+            <w:rStyle w:val="Hipervnculo"/>
+          </w:rPr>
+          <w:t>diemart2@hotmail.com</w:t>
+        </w:r>
+      </w:hyperlink>
+      <w:r>
+        <w:t>,</w:t>
+      </w:r>
+    </w:p>
+    <w:p>
+      <w:r>
+        <w:t>lucasrocha20.63@gmail.com</w:t>
+      </w:r>
+      <w:r>
+        <w:t>,</w:t>
       </w:r>
       <w:r>
         <w:br/>
@@ -261,7 +279,7 @@
       <w:r>
         <w:br/>
       </w:r>
-      <w:hyperlink r:id="rId4" w:history="1">
+      <w:hyperlink r:id="rId5" w:history="1">
         <w:r>
           <w:rPr>
             <w:rStyle w:val="Hipervnculo"/>
@@ -332,7 +350,7 @@
       <w:r>
         <w:br/>
       </w:r>
-      <w:hyperlink r:id="rId5" w:history="1">
+      <w:hyperlink r:id="rId6" w:history="1">
         <w:r>
           <w:rPr>
             <w:rStyle w:val="Hipervnculo"/>

</xml_diff>